<commit_message>
feat: ROM chapter SOPs as plain-body + audit appendix (one file)
Converts all 6 ROM SOPs (ROM.1.a, ROM.1.b, ROM.1.e, ROM.3.d, ROM.4.a,
ROM.4.c) to the same format approved for FMS: plain-language body with
safety/accountability-framed "Why:" reasoning and zero inline NABH codes,
page break, then an Appendix with OE codes, boundary notes, and verified
hyperlinked sources. No existing build script existed for ROM, so a new
build_rom_sops_v2.py was written from the live docx content and verified
citation URLs. Records untouched.

Co-Authored-By: Claude Sonnet 5 <noreply@anthropic.com>
Claude-Session: https://claude.ai/code/session_016VFLsECWt4VArpBiaqgrgF
</commit_message>
<xml_diff>
--- a/policies/build/sop_record_masters/ROM/SOP_ROM.1.a_governance_roles.docx
+++ b/policies/build/sop_record_masters/ROM/SOP_ROM.1.a_governance_roles.docx
@@ -14,40 +14,9 @@
     </w:p>
     <w:p>
       <w:r>
-        <w:t>«Hospital Name» — Supports ROM.1.a</w:t>
+        <w:t>«Hospital Name» — SOP-ROM.1.a — Version 1.0</w:t>
       </w:r>
     </w:p>
-    <w:p/>
-    <w:tbl>
-      <w:tblPr>
-        <w:tblStyle w:val="TableGrid"/>
-        <w:tblW w:type="auto" w:w="0"/>
-        <w:tblLook w:firstColumn="1" w:firstRow="1" w:lastColumn="0" w:lastRow="0" w:noHBand="0" w:noVBand="1" w:val="04A0"/>
-      </w:tblPr>
-      <w:tblGrid>
-        <w:gridCol w:w="8640"/>
-      </w:tblGrid>
-      <w:tr>
-        <w:tc>
-          <w:tcPr>
-            <w:tcW w:type="dxa" w:w="8640"/>
-          </w:tcPr>
-          <w:p>
-            <w:r>
-              <w:rPr>
-                <w:b/>
-              </w:rPr>
-              <w:t>Why does this SOP exist? (read this first if you're new)</w:t>
-            </w:r>
-          </w:p>
-          <w:p>
-            <w:r>
-              <w:t>This SOP explains how «Hospital Name» identifies and documents who is responsible for governance, including what happens the day a role becomes vacant. If you're new to this SOP: a governance role only counts as identified once it's in the register with a named person and written responsibilities, and a vacancy only counts as managed once an interim holder is designated — leaving a role blank until someone gets around to filling it does not satisfy this requirement.</w:t>
-            </w:r>
-          </w:p>
-        </w:tc>
-      </w:tr>
-    </w:tbl>
     <w:p/>
     <w:tbl>
       <w:tblPr>
@@ -62,9 +31,6 @@
         <w:gridCol w:w="2160"/>
       </w:tblGrid>
       <w:tr>
-        <w:trPr>
-          <w:cantSplit/>
-        </w:trPr>
         <w:tc>
           <w:tcPr>
             <w:tcW w:type="dxa" w:w="2160"/>
@@ -81,7 +47,7 @@
           </w:tcPr>
           <w:p>
             <w:r>
-              <w:t>«Hospital to define»</w:t>
+              <w:t>SOP-ROM.1.a</w:t>
             </w:r>
           </w:p>
         </w:tc>
@@ -107,9 +73,6 @@
         </w:tc>
       </w:tr>
       <w:tr>
-        <w:trPr>
-          <w:cantSplit/>
-        </w:trPr>
         <w:tc>
           <w:tcPr>
             <w:tcW w:type="dxa" w:w="2160"/>
@@ -151,51 +114,6 @@
           </w:p>
         </w:tc>
       </w:tr>
-      <w:tr>
-        <w:trPr>
-          <w:cantSplit/>
-        </w:trPr>
-        <w:tc>
-          <w:tcPr>
-            <w:tcW w:type="dxa" w:w="2160"/>
-          </w:tcPr>
-          <w:p>
-            <w:r>
-              <w:t>Prepared By</w:t>
-            </w:r>
-          </w:p>
-        </w:tc>
-        <w:tc>
-          <w:tcPr>
-            <w:tcW w:type="dxa" w:w="2160"/>
-          </w:tcPr>
-          <w:p>
-            <w:r>
-              <w:t>Quality Coordinator   Name: ________   Signature: ________</w:t>
-            </w:r>
-          </w:p>
-        </w:tc>
-        <w:tc>
-          <w:tcPr>
-            <w:tcW w:type="dxa" w:w="2160"/>
-          </w:tcPr>
-          <w:p>
-            <w:r>
-              <w:t>Approved By</w:t>
-            </w:r>
-          </w:p>
-        </w:tc>
-        <w:tc>
-          <w:tcPr>
-            <w:tcW w:type="dxa" w:w="2160"/>
-          </w:tcPr>
-          <w:p>
-            <w:r>
-              <w:t>Medical Superintendent   Name: ________   Signature: ________</w:t>
-            </w:r>
-          </w:p>
-        </w:tc>
-      </w:tr>
     </w:tbl>
     <w:p/>
     <w:p>
@@ -206,9 +124,78 @@
         <w:t>1. Purpose</w:t>
       </w:r>
     </w:p>
+    <w:tbl>
+      <w:tblPr>
+        <w:tblStyle w:val="TableGrid"/>
+        <w:tblW w:type="auto" w:w="0"/>
+        <w:tblLook w:firstColumn="1" w:firstRow="1" w:lastColumn="0" w:lastRow="0" w:noHBand="0" w:noVBand="1" w:val="04A0"/>
+      </w:tblPr>
+      <w:tblGrid>
+        <w:gridCol w:w="8640"/>
+      </w:tblGrid>
+      <w:tr>
+        <w:tc>
+          <w:tcPr>
+            <w:tcW w:type="dxa" w:w="8640"/>
+          </w:tcPr>
+          <w:p>
+            <w:r>
+              <w:t>This SOP sets out how «Hospital Name» identifies who is responsible for governance, documents each role holder's designation and responsibilities, and manages a vacancy without a gap in accountability -- so governance is written down, not assumed, at every point including a transition.</w:t>
+            </w:r>
+          </w:p>
+        </w:tc>
+      </w:tr>
+    </w:tbl>
+    <w:p/>
+    <w:tbl>
+      <w:tblPr>
+        <w:tblStyle w:val="TableGrid"/>
+        <w:tblW w:type="auto" w:w="0"/>
+        <w:tblLook w:firstColumn="1" w:firstRow="1" w:lastColumn="0" w:lastRow="0" w:noHBand="0" w:noVBand="1" w:val="04A0"/>
+      </w:tblPr>
+      <w:tblGrid>
+        <w:gridCol w:w="8640"/>
+      </w:tblGrid>
+      <w:tr>
+        <w:tc>
+          <w:tcPr>
+            <w:tcW w:type="dxa" w:w="8640"/>
+          </w:tcPr>
+          <w:p>
+            <w:r>
+              <w:t>A board member resigns with no notice. Without this SOP, nobody is sure who's accountable for governance decisions in the gap -- with it, the governing body designates an interim holder before the register even needs updating.</w:t>
+            </w:r>
+          </w:p>
+        </w:tc>
+      </w:tr>
+    </w:tbl>
+    <w:p/>
+    <w:tbl>
+      <w:tblPr>
+        <w:tblStyle w:val="TableGrid"/>
+        <w:tblW w:type="auto" w:w="0"/>
+        <w:tblLook w:firstColumn="1" w:firstRow="1" w:lastColumn="0" w:lastRow="0" w:noHBand="0" w:noVBand="1" w:val="04A0"/>
+      </w:tblPr>
+      <w:tblGrid>
+        <w:gridCol w:w="8640"/>
+      </w:tblGrid>
+      <w:tr>
+        <w:tc>
+          <w:tcPr>
+            <w:tcW w:type="dxa" w:w="8640"/>
+          </w:tcPr>
+          <w:p>
+            <w:r>
+              <w:t>We do this because governance that exists only as an informal understanding of who's in charge can't be checked, handed over, or held accountable when something goes wrong. Writing it down is what makes governance real instead of assumed.</w:t>
+            </w:r>
+          </w:p>
+        </w:tc>
+      </w:tr>
+    </w:tbl>
+    <w:p/>
     <w:p>
       <w:r>
-        <w:t>This SOP sets out how «Hospital Name» identifies who is responsible for governance, documents each role holder's designation and responsibilities, and manages a governance-role vacancy without a gap in accountability, so that governance is written down rather than assumed at every point in time, including a transition.</w:t>
+        <w:t>To define how «Hospital Name» identifies who is responsible for governance, documents each role holder's designation and responsibilities, and manages a governance-role vacancy without a gap in accountability.</w:t>
       </w:r>
     </w:p>
     <w:p>
@@ -221,7 +208,18 @@
     </w:p>
     <w:p>
       <w:r>
-        <w:t>This SOP applies to the governing body and the «Medical Superintendent» at «Hospital Name», and to department and service heads who need to understand the reporting lines it produces.</w:t>
+        <w:rPr>
+          <w:i/>
+        </w:rPr>
+        <w:t xml:space="preserve">Why: </w:t>
+      </w:r>
+      <w:r>
+        <w:t>so department and service heads actually know who they report to for governance decisions -- not just the governing body itself.</w:t>
+      </w:r>
+    </w:p>
+    <w:p>
+      <w:r>
+        <w:t>Applies to the governing body and the Medical Superintendent, and to department and service heads who need to understand the reporting lines it produces.</w:t>
       </w:r>
     </w:p>
     <w:p>
@@ -235,12 +233,23 @@
     <w:p>
       <w:r>
         <w:rPr>
+          <w:i/>
+        </w:rPr>
+        <w:t xml:space="preserve">Why: </w:t>
+      </w:r>
+      <w:r>
+        <w:t>a governance register nobody actually maintains or checks drifts out of date within months -- naming who holds it and who audits it is what keeps it true.</w:t>
+      </w:r>
+    </w:p>
+    <w:p>
+      <w:r>
+        <w:rPr>
           <w:b/>
         </w:rPr>
         <w:t xml:space="preserve">Medical Superintendent: </w:t>
       </w:r>
       <w:r>
-        <w:t>holds and keeps current the governance register, communicates the governance structure to department and service heads, and flags a governance-role vacancy to the governing body immediately.</w:t>
+        <w:t>Holds and keeps current the governance register, communicates the governance structure to department and service heads, and flags a vacancy to the governing body immediately.</w:t>
       </w:r>
     </w:p>
     <w:p>
@@ -251,7 +260,7 @@
         <w:t xml:space="preserve">Governing Body: </w:t>
       </w:r>
       <w:r>
-        <w:t>confirms each role holder's designation and documented responsibilities, signs off any change, and designates an interim holder when a role becomes vacant.</w:t>
+        <w:t>Confirms each role holder's designation and documented responsibilities, signs off any change, and designates an interim holder when a role becomes vacant.</w:t>
       </w:r>
     </w:p>
     <w:p>
@@ -262,7 +271,7 @@
         <w:t xml:space="preserve">Quality Coordinator: </w:t>
       </w:r>
       <w:r>
-        <w:t>audits the register quarterly for currency.</w:t>
+        <w:t>Audits the register quarterly for currency.</w:t>
       </w:r>
     </w:p>
     <w:p>
@@ -270,7 +279,7 @@
         <w:pStyle w:val="Heading1"/>
       </w:pPr>
       <w:r>
-        <w:t>4. Procedure</w:t>
+        <w:t>4. What to do</w:t>
       </w:r>
     </w:p>
     <w:p>
@@ -278,33 +287,33 @@
         <w:pStyle w:val="Heading2"/>
       </w:pPr>
       <w:r>
-        <w:t>4.1 Identify and register each governance role</w:t>
+        <w:t>Identify and register each governance role</w:t>
       </w:r>
     </w:p>
     <w:p>
       <w:r>
         <w:rPr>
-          <w:b/>
+          <w:i/>
         </w:rPr>
-        <w:t xml:space="preserve">Why this step matters: </w:t>
+        <w:t xml:space="preserve">Why: </w:t>
       </w:r>
       <w:r>
-        <w:t>Governance that exists only as an informal understanding of who's in charge cannot be checked, handed over, or held accountable — writing it down is what makes governance real rather than assumed.</w:t>
+        <w:t>Governance that exists only as an informal understanding of who's in charge can't be checked, handed over, or held accountable -- writing it down is what makes it real.</w:t>
       </w:r>
     </w:p>
     <w:p>
       <w:r>
-        <w:t>1. The Medical Superintendent lists every person responsible for governance — owner(s), board members, trustees or equivalent — by name and designation.</w:t>
+        <w:t>The Medical Superintendent lists every person responsible for governance -- owners, board members, trustees or equivalent -- by name and designation.</w:t>
       </w:r>
     </w:p>
     <w:p>
       <w:r>
-        <w:t>2. Each role holder's documented responsibilities are recorded against their entry in the governance register.</w:t>
+        <w:t>Each role holder's documented responsibilities are recorded against their entry in the governance register.</w:t>
       </w:r>
     </w:p>
     <w:p>
       <w:r>
-        <w:t>3. The governing body confirms the register is accurate and complete. (Record 1)</w:t>
+        <w:t>The governing body confirms the register is accurate and complete.</w:t>
       </w:r>
     </w:p>
     <w:p>
@@ -312,28 +321,28 @@
         <w:pStyle w:val="Heading2"/>
       </w:pPr>
       <w:r>
-        <w:t>4.2 Communicate the structure</w:t>
+        <w:t>Communicate the structure</w:t>
       </w:r>
     </w:p>
     <w:p>
       <w:r>
         <w:rPr>
-          <w:b/>
+          <w:i/>
         </w:rPr>
-        <w:t xml:space="preserve">Why this step matters: </w:t>
+        <w:t xml:space="preserve">Why: </w:t>
       </w:r>
       <w:r>
-        <w:t>A governance register nobody below the top knows about doesn't change how decisions actually get made day to day — department heads have to know who is actually accountable for what.</w:t>
+        <w:t>A governance register nobody below the top knows about doesn't change how decisions actually get made day to day -- department heads have to know who is actually accountable for what.</w:t>
       </w:r>
     </w:p>
     <w:p>
       <w:r>
-        <w:t>1. The Medical Superintendent communicates the governance structure and reporting lines to department and service heads.</w:t>
+        <w:t>The Medical Superintendent communicates the governance structure and reporting lines to department and service heads.</w:t>
       </w:r>
     </w:p>
     <w:p>
       <w:r>
-        <w:t>2. Department heads confirm they understand who is accountable for governance decisions that affect their area. (Record 1)</w:t>
+        <w:t>Department heads confirm they understand who is accountable for governance decisions that affect their area.</w:t>
       </w:r>
     </w:p>
     <w:p>
@@ -341,33 +350,33 @@
         <w:pStyle w:val="Heading2"/>
       </w:pPr>
       <w:r>
-        <w:t>4.3 Manage a governance-role vacancy without a gap</w:t>
+        <w:t>Manage a vacancy without a gap</w:t>
       </w:r>
     </w:p>
     <w:p>
       <w:r>
         <w:rPr>
-          <w:b/>
+          <w:i/>
         </w:rPr>
-        <w:t xml:space="preserve">Why this step matters: </w:t>
+        <w:t xml:space="preserve">Why: </w:t>
       </w:r>
       <w:r>
-        <w:t>A governance role left silently vacant — after a resignation, incapacitation, or removal — leaves a real accountability gap exactly where the register claims none exists; the register is only trustworthy if a vacancy is handled as deliberately as a confirmed appointment.</w:t>
+        <w:t>A governance role left silently vacant -- after a resignation, incapacitation, or removal -- leaves a real accountability gap exactly where the register claims none exists.</w:t>
       </w:r>
     </w:p>
     <w:p>
       <w:r>
-        <w:t>1. When a governance role becomes vacant, the Medical Superintendent notifies the governing body within «the hospital-defined notification period» -- the hospital states this as a specific number of days in its own SOP; no external body prescribes it.</w:t>
+        <w:t>When a governance role becomes vacant, the Medical Superintendent notifies the governing body within «the hospital-defined notification period».</w:t>
       </w:r>
     </w:p>
     <w:p>
       <w:r>
-        <w:t>2. The governing body designates an interim role holder, or reassigns the responsibilities on an interim basis, before the register is updated to show the role as filled.</w:t>
+        <w:t>The governing body designates an interim role holder, or reassigns the responsibilities on an interim basis, before the register is updated to show the role as filled.</w:t>
       </w:r>
     </w:p>
     <w:p>
       <w:r>
-        <w:t>3. A permanent appointment, once made, is recorded in the register the same way as any other entry, closing out the interim period. (Record 2)</w:t>
+        <w:t>A permanent appointment, once made, is recorded in the register the same way as any other entry, closing out the interim period.</w:t>
       </w:r>
     </w:p>
     <w:p>
@@ -375,15 +384,15 @@
         <w:pStyle w:val="Heading2"/>
       </w:pPr>
       <w:r>
-        <w:t>4.4 Review and update</w:t>
+        <w:t>Review and update</w:t>
       </w:r>
     </w:p>
     <w:p>
       <w:r>
         <w:rPr>
-          <w:b/>
+          <w:i/>
         </w:rPr>
-        <w:t xml:space="preserve">Why this step matters: </w:t>
+        <w:t xml:space="preserve">Why: </w:t>
       </w:r>
       <w:r>
         <w:t>A register that was accurate on the day it was written but never updated again is exactly how an accreditation assessor finds a governance role that no longer matches who is actually there.</w:t>
@@ -391,12 +400,12 @@
     </w:p>
     <w:p>
       <w:r>
-        <w:t>1. The governance register is reviewed at least annually, or immediately when a governance role changes.</w:t>
+        <w:t>The governance register is reviewed at least annually, or immediately when a governance role changes.</w:t>
       </w:r>
     </w:p>
     <w:p>
       <w:r>
-        <w:t>2. The Quality Coordinator confirms, during the quarterly audit, that the register is current. (Record 1)</w:t>
+        <w:t>The Quality Coordinator confirms, during the quarterly audit, that the register is current.</w:t>
       </w:r>
     </w:p>
     <w:p>
@@ -417,7 +426,7 @@
         <w:pStyle w:val="Heading1"/>
       </w:pPr>
       <w:r>
-        <w:t>6. Related Documents</w:t>
+        <w:t>6. Related SOPs</w:t>
       </w:r>
     </w:p>
     <w:p>
@@ -425,7 +434,78 @@
         <w:pStyle w:val="ListParagraph"/>
       </w:pPr>
       <w:r>
-        <w:t>Policy on Governance — Roles, Responsibilities and Ethical Management (ROM.1) — this SOP operationalises step 5.1</w:t>
+        <w:t>Policy on Governance — Roles, Responsibilities and Ethical Management (ROM.1)</w:t>
+      </w:r>
+    </w:p>
+    <w:p>
+      <w:pPr>
+        <w:pStyle w:val="Heading1"/>
+      </w:pPr>
+      <w:r>
+        <w:t>7. Review</w:t>
+      </w:r>
+    </w:p>
+    <w:p>
+      <w:r>
+        <w:t>This SOP is reviewed at least annually by the Quality Coordinator together with the Medical Superintendent, and sooner if the quarterly audit finds the register out of date, or a vacancy is handled outside this SOP.</w:t>
+      </w:r>
+    </w:p>
+    <w:p>
+      <w:r>
+        <w:br w:type="page"/>
+      </w:r>
+    </w:p>
+    <w:p>
+      <w:pPr>
+        <w:pStyle w:val="Heading1"/>
+      </w:pPr>
+      <w:r>
+        <w:t>Appendix — NABH Standard Cross-Reference and Evidence Basis</w:t>
+      </w:r>
+    </w:p>
+    <w:p>
+      <w:r>
+        <w:t>For the Quality Coordinator and NABH assessment use only. The reasoning and real-world triggers for each requirement are already in the body above -- this appendix adds only what the body deliberately leaves out: the exact objective-element code, how this SOP's scope is kept separate from neighbouring standards, and the verified technical source for anything cited.</w:t>
+      </w:r>
+    </w:p>
+    <w:p>
+      <w:pPr>
+        <w:pStyle w:val="Heading2"/>
+      </w:pPr>
+      <w:r>
+        <w:t>Identify and register each governance role — ROM.1.a</w:t>
+      </w:r>
+    </w:p>
+    <w:p>
+      <w:pPr>
+        <w:pStyle w:val="Heading2"/>
+      </w:pPr>
+      <w:r>
+        <w:t>Communicate the structure — ROM.1.a</w:t>
+      </w:r>
+    </w:p>
+    <w:p>
+      <w:pPr>
+        <w:pStyle w:val="Heading2"/>
+      </w:pPr>
+      <w:r>
+        <w:t>Manage a vacancy without a gap — ROM.1.a</w:t>
+      </w:r>
+    </w:p>
+    <w:p>
+      <w:pPr>
+        <w:pStyle w:val="Heading2"/>
+      </w:pPr>
+      <w:r>
+        <w:t>Review and update — ROM.1.a</w:t>
+      </w:r>
+    </w:p>
+    <w:p>
+      <w:pPr>
+        <w:pStyle w:val="Heading2"/>
+      </w:pPr>
+      <w:r>
+        <w:t>Full reference list</w:t>
       </w:r>
     </w:p>
     <w:p>
@@ -433,25 +513,10 @@
         <w:pStyle w:val="ListParagraph"/>
       </w:pPr>
       <w:r>
-        <w:t>Required Records — ROM.1.a (see ROM.1 Records folder)</w:t>
+        <w:t xml:space="preserve">• </w:t>
       </w:r>
-    </w:p>
-    <w:p>
-      <w:pPr>
-        <w:pStyle w:val="Heading1"/>
-      </w:pPr>
       <w:r>
-        <w:t>7. Where This SOP's Requirements Come From (Verified Sources)</w:t>
-      </w:r>
-    </w:p>
-    <w:p>
-      <w:pPr>
-        <w:pStyle w:val="ListParagraph"/>
-        <w:spacing w:after="240" w:before="80"/>
-        <w:contextualSpacing w:val="0"/>
-      </w:pPr>
-      <w:r>
-        <w:t xml:space="preserve">• National Accreditation Board for Hospitals and Healthcare Providers. (2022). Standards for Small Healthcare Organisations (3rd ed.). </w:t>
+        <w:t xml:space="preserve">National Accreditation Board for Hospitals and Healthcare Providers. (2022). Standards for Small Healthcare Organisations (3rd ed.). </w:t>
       </w:r>
       <w:hyperlink r:id="rId9">
         <w:r>
@@ -464,19 +529,6 @@
       </w:hyperlink>
       <w:r>
         <w:t>. Responsibilities of Management chapter, standard ROM.1.</w:t>
-      </w:r>
-    </w:p>
-    <w:p>
-      <w:pPr>
-        <w:pStyle w:val="Heading1"/>
-      </w:pPr>
-      <w:r>
-        <w:t>8. Review</w:t>
-      </w:r>
-    </w:p>
-    <w:p>
-      <w:r>
-        <w:t>This SOP is reviewed at least annually by the Quality Coordinator together with the Medical Superintendent, and sooner if the quarterly audit finds the register out of date, or a vacancy is handled outside this SOP.</w:t>
       </w:r>
     </w:p>
     <w:sectPr>

</xml_diff>

<commit_message>
Rebuild ROM SOPs — remove italic Why: label (template fix retrofit)
Reruns build_rom_sops_v2.py against the already-fixed
sop_record_common.py so ROM's SOP body text drops the "Why:" label
in the same way PSQ/HIC/IMS already do. No content or source
changes — mechanical re-render only.

Co-Authored-By: Claude Sonnet 5 <noreply@anthropic.com>
Claude-Session: https://claude.ai/code/session_016VFLsECWt4VArpBiaqgrgF
</commit_message>
<xml_diff>
--- a/policies/build/sop_record_masters/ROM/SOP_ROM.1.a_governance_roles.docx
+++ b/policies/build/sop_record_masters/ROM/SOP_ROM.1.a_governance_roles.docx
@@ -208,12 +208,6 @@
     </w:p>
     <w:p>
       <w:r>
-        <w:rPr>
-          <w:i/>
-        </w:rPr>
-        <w:t xml:space="preserve">Why: </w:t>
-      </w:r>
-      <w:r>
         <w:t>so department and service heads actually know who they report to for governance decisions -- not just the governing body itself.</w:t>
       </w:r>
     </w:p>
@@ -231,12 +225,6 @@
       </w:r>
     </w:p>
     <w:p>
-      <w:r>
-        <w:rPr>
-          <w:i/>
-        </w:rPr>
-        <w:t xml:space="preserve">Why: </w:t>
-      </w:r>
       <w:r>
         <w:t>a governance register nobody actually maintains or checks drifts out of date within months -- naming who holds it and who audits it is what keeps it true.</w:t>
       </w:r>
@@ -292,12 +280,6 @@
     </w:p>
     <w:p>
       <w:r>
-        <w:rPr>
-          <w:i/>
-        </w:rPr>
-        <w:t xml:space="preserve">Why: </w:t>
-      </w:r>
-      <w:r>
         <w:t>Governance that exists only as an informal understanding of who's in charge can't be checked, handed over, or held accountable -- writing it down is what makes it real.</w:t>
       </w:r>
     </w:p>
@@ -326,12 +308,6 @@
     </w:p>
     <w:p>
       <w:r>
-        <w:rPr>
-          <w:i/>
-        </w:rPr>
-        <w:t xml:space="preserve">Why: </w:t>
-      </w:r>
-      <w:r>
         <w:t>A governance register nobody below the top knows about doesn't change how decisions actually get made day to day -- department heads have to know who is actually accountable for what.</w:t>
       </w:r>
     </w:p>
@@ -354,12 +330,6 @@
       </w:r>
     </w:p>
     <w:p>
-      <w:r>
-        <w:rPr>
-          <w:i/>
-        </w:rPr>
-        <w:t xml:space="preserve">Why: </w:t>
-      </w:r>
       <w:r>
         <w:t>A governance role left silently vacant -- after a resignation, incapacitation, or removal -- leaves a real accountability gap exactly where the register claims none exists.</w:t>
       </w:r>
@@ -388,12 +358,6 @@
       </w:r>
     </w:p>
     <w:p>
-      <w:r>
-        <w:rPr>
-          <w:i/>
-        </w:rPr>
-        <w:t xml:space="preserve">Why: </w:t>
-      </w:r>
       <w:r>
         <w:t>A register that was accurate on the day it was written but never updated again is exactly how an accreditation assessor finds a governance role that no longer matches who is actually there.</w:t>
       </w:r>

</xml_diff>